<commit_message>
Report: fix overlapping text in pipeline figure
Co-Authored-By: Claude Opus 5.5 <noreply@anthropic.com>
</commit_message>
<xml_diff>
--- a/01-mule-radar/report/MuleRadar_Submission.docx
+++ b/01-mule-radar/report/MuleRadar_Submission.docx
@@ -662,7 +662,7 @@
       <w:r>
         <w:drawing>
           <wp:inline distT="0" distB="0" distL="0" distR="0">
-            <wp:extent cx="5905500" cy="1581150"/>
+            <wp:extent cx="5905500" cy="1438275"/>
             <wp:effectExtent t="0" r="0" b="0" l="0"/>
             <wp:docPr id="1" name="pipeline.png" descr="Figure 1. MuleRadar pipeline. Everything up to the risk model runs on one GPU." title="Figure 1. MuleRadar pipeline. Everything up to the risk model runs on one GPU."/>
             <wp:cNvGraphicFramePr>
@@ -687,7 +687,7 @@
                   <pic:spPr bwMode="auto">
                     <a:xfrm>
                       <a:off x="0" y="0"/>
-                      <a:ext cx="5905500" cy="1581150"/>
+                      <a:ext cx="5905500" cy="1438275"/>
                     </a:xfrm>
                     <a:prstGeom prst="rect">
                       <a:avLst/>
@@ -3483,7 +3483,7 @@
         </w:numPr>
         <w:spacing w:after="60"/>
       </w:pPr>
-      <w:hyperlink w:history="1" r:id="rIdcey1v_-t65_lwdgyn1avr">
+      <w:hyperlink w:history="1" r:id="rIdg51fe2qelawkfiewi6znl">
         <w:r>
           <w:rPr>
             <w:rFonts w:ascii="Arial" w:cs="Arial" w:eastAsia="Arial" w:hAnsi="Arial"/>
@@ -3505,7 +3505,7 @@
         </w:numPr>
         <w:spacing w:after="60"/>
       </w:pPr>
-      <w:hyperlink w:history="1" r:id="rIdzakg2la-ugodsr04rlwgn">
+      <w:hyperlink w:history="1" r:id="rIdfoalztgabk1benca7txwi">
         <w:r>
           <w:rPr>
             <w:rFonts w:ascii="Arial" w:cs="Arial" w:eastAsia="Arial" w:hAnsi="Arial"/>
@@ -3527,7 +3527,7 @@
         </w:numPr>
         <w:spacing w:after="60"/>
       </w:pPr>
-      <w:hyperlink w:history="1" r:id="rIdabdtmvytwpg7apihfesh_">
+      <w:hyperlink w:history="1" r:id="rIddphxlyrnzjvqjegnn61u4">
         <w:r>
           <w:rPr>
             <w:rFonts w:ascii="Arial" w:cs="Arial" w:eastAsia="Arial" w:hAnsi="Arial"/>
@@ -3549,7 +3549,7 @@
         </w:numPr>
         <w:spacing w:after="60"/>
       </w:pPr>
-      <w:hyperlink w:history="1" r:id="rIdypjcjjxitotk_seqbz4fx">
+      <w:hyperlink w:history="1" r:id="rIdm3m4_s-w2d1lul-wi8z-t">
         <w:r>
           <w:rPr>
             <w:rFonts w:ascii="Arial" w:cs="Arial" w:eastAsia="Arial" w:hAnsi="Arial"/>
@@ -3571,7 +3571,7 @@
         </w:numPr>
         <w:spacing w:after="60"/>
       </w:pPr>
-      <w:hyperlink w:history="1" r:id="rIdwhmw8orpdxakpypcsuxlq">
+      <w:hyperlink w:history="1" r:id="rId_ao_tbbbydokbng8ev4ph">
         <w:r>
           <w:rPr>
             <w:rFonts w:ascii="Arial" w:cs="Arial" w:eastAsia="Arial" w:hAnsi="Arial"/>

</xml_diff>